<commit_message>
Promote Fixed_Y V3 notebook and simplify live demo weather UI.
Make Auto (live) the default road-conditions control, drop the Force checkbox, sync parts for V3 section layout, and refresh swimlane/PR7 docs.

Co-authored-by: Cursor <cursoragent@cursor.com>
</commit_message>
<xml_diff>
--- a/explanations/Glossary.docx
+++ b/explanations/Glossary.docx
@@ -18,7 +18,7 @@
     </w:p>
     <w:p>
       <w:r>
-        <w:t>Auto-generated 2026-07-02 05:23 UTC from explanations/definitions.json. Primary notebook: notebooks/capstone_with_results.ipynb</w:t>
+        <w:t>Auto-generated 2026-07-22 15:31 UTC from explanations/definitions.json. Primary notebook: notebooks/capstone_with_results.ipynb</w:t>
       </w:r>
     </w:p>
     <w:p/>
@@ -80,7 +80,7 @@
           </w:tcPr>
           <w:p>
             <w:r>
-              <w:t>The Ontario highway safety AI system that fuses text alerts, road images, and collision data to produce a composite Safety Score and speed recommendation.</w:t>
+              <w:t>Ontario highway safety AI that fuses text alerts, road images, and environmental risk into a composite Safety Score and route guidance.</w:t>
             </w:r>
           </w:p>
         </w:tc>
@@ -105,7 +105,32 @@
           </w:tcPr>
           <w:p>
             <w:r>
-              <w:t>Three pillars: NLP Brain (text), Vision Brain (images), Logistic Optimizer (tabular ML), fused into one Safety Score.</w:t>
+              <w:t>Three pillars: NLP Brain (T), Vision Brain (V), Environment/tabular (E), fused into Safety Score S.</w:t>
+            </w:r>
+          </w:p>
+        </w:tc>
+      </w:tr>
+      <w:tr>
+        <w:tc>
+          <w:tcPr>
+            <w:tcW w:type="dxa" w:w="2592"/>
+          </w:tcPr>
+          <w:p>
+            <w:r>
+              <w:rPr>
+                <w:b/>
+              </w:rPr>
+              <w:t>Notebook Parts</w:t>
+            </w:r>
+          </w:p>
+        </w:tc>
+        <w:tc>
+          <w:tcPr>
+            <w:tcW w:type="dxa" w:w="6768"/>
+          </w:tcPr>
+          <w:p>
+            <w:r>
+              <w:t>Modular runnable notebooks under notebooks/parts/ (01–04), synced into capstone_with_results.ipynb.</w:t>
             </w:r>
           </w:p>
         </w:tc>
@@ -130,7 +155,7 @@
           </w:tcPr>
           <w:p>
             <w:r>
-              <w:t>Scores Ontario 511-style alerts using TF-IDF and a hazard lexicon. Output: T score (0-1).</w:t>
+              <w:t>Scores Ontario 511-style alerts using TF-IDF and a hazard lexicon. Output: T in [0,1].</w:t>
             </w:r>
           </w:p>
         </w:tc>
@@ -155,7 +180,32 @@
           </w:tcPr>
           <w:p>
             <w:r>
-              <w:t>ResNet18 CNN fine-tuned on road-surface images. Output: V score (vision hazard probability).</w:t>
+              <w:t>ResNet18 fine-tuned on balanced RSCD road images (~1086). Optional AE is experimental. Output: V in [0,1].</w:t>
+            </w:r>
+          </w:p>
+        </w:tc>
+      </w:tr>
+      <w:tr>
+        <w:tc>
+          <w:tcPr>
+            <w:tcW w:type="dxa" w:w="2592"/>
+          </w:tcPr>
+          <w:p>
+            <w:r>
+              <w:rPr>
+                <w:b/>
+              </w:rPr>
+              <w:t>Autoencoder (AE)</w:t>
+            </w:r>
+          </w:p>
+        </w:tc>
+        <w:tc>
+          <w:tcPr>
+            <w:tcW w:type="dxa" w:w="6768"/>
+          </w:tcPr>
+          <w:p>
+            <w:r>
+              <w:t>Clear-Asphalt reconstruction model for anomaly score; trained and compared but not selected for production (use_hybrid=False).</w:t>
             </w:r>
           </w:p>
         </w:tc>
@@ -180,7 +230,7 @@
           </w:tcPr>
           <w:p>
             <w:r>
-              <w:t>Tabular classifiers predicting collision severity from structured features.</w:t>
+              <w:t>Tabular classifiers predicting collision severity; RF used for SHAP/deploy; GLU best fatal recall in W10 compare.</w:t>
             </w:r>
           </w:p>
         </w:tc>
@@ -205,7 +255,7 @@
           </w:tcPr>
           <w:p>
             <w:r>
-              <w:t>Composite score 0-100: S = (w_T*T + w_V*V + w_E*E) x 100. Higher S = higher risk.</w:t>
+              <w:t>S = (0.25*T + 0.35*V + 0.40*E_index) x 100. Higher S = higher risk. Paper 1 SPI analogue.</w:t>
             </w:r>
           </w:p>
         </w:tc>
@@ -230,7 +280,7 @@
           </w:tcPr>
           <w:p>
             <w:r>
-              <w:t>Text hazard score from TF-IDF on weather/traffic alerts.</w:t>
+              <w:t>Text hazard score from TF-IDF on live or preset 511-style alerts.</w:t>
             </w:r>
           </w:p>
         </w:tc>
@@ -255,7 +305,7 @@
           </w:tcPr>
           <w:p>
             <w:r>
-              <w:t>Vision hazard probability for wet/snow/ice road conditions.</w:t>
+              <w:t>Vision hazard from calibrated Mean V in vision_meta.json (ResNet backend).</w:t>
             </w:r>
           </w:p>
         </w:tc>
@@ -280,7 +330,82 @@
           </w:tcPr>
           <w:p>
             <w:r>
-              <w:t>Environmental risk from weather, surface, season, time-of-day (calibrated on UK DfT data).</w:t>
+              <w:t>0.35*surface + 0.30*visibility + 0.20*wind + 0.15*temp; Paper 2 grounded.</w:t>
+            </w:r>
+          </w:p>
+        </w:tc>
+      </w:tr>
+      <w:tr>
+        <w:tc>
+          <w:tcPr>
+            <w:tcW w:type="dxa" w:w="2592"/>
+          </w:tcPr>
+          <w:p>
+            <w:r>
+              <w:rPr>
+                <w:b/>
+              </w:rPr>
+              <w:t>RSCD</w:t>
+            </w:r>
+          </w:p>
+        </w:tc>
+        <w:tc>
+          <w:tcPr>
+            <w:tcW w:type="dxa" w:w="6768"/>
+          </w:tcPr>
+          <w:p>
+            <w:r>
+              <w:t>Road Surface Condition Dataset (HuggingFace); curated local vision_cache working sample.</w:t>
+            </w:r>
+          </w:p>
+        </w:tc>
+      </w:tr>
+      <w:tr>
+        <w:tc>
+          <w:tcPr>
+            <w:tcW w:type="dxa" w:w="2592"/>
+          </w:tcPr>
+          <w:p>
+            <w:r>
+              <w:rPr>
+                <w:b/>
+              </w:rPr>
+              <w:t>Open-Meteo</w:t>
+            </w:r>
+          </w:p>
+        </w:tc>
+        <w:tc>
+          <w:tcPr>
+            <w:tcW w:type="dxa" w:w="6768"/>
+          </w:tcPr>
+          <w:p>
+            <w:r>
+              <w:t>Live weather API (no key) used when weather='auto'.</w:t>
+            </w:r>
+          </w:p>
+        </w:tc>
+      </w:tr>
+      <w:tr>
+        <w:tc>
+          <w:tcPr>
+            <w:tcW w:type="dxa" w:w="2592"/>
+          </w:tcPr>
+          <w:p>
+            <w:r>
+              <w:rPr>
+                <w:b/>
+              </w:rPr>
+              <w:t>Ontario 511</w:t>
+            </w:r>
+          </w:p>
+        </w:tc>
+        <w:tc>
+          <w:tcPr>
+            <w:tcW w:type="dxa" w:w="6768"/>
+          </w:tcPr>
+          <w:p>
+            <w:r>
+              <w:t>Live traffic/event alerts; preset alerts remain fallback when live fails or user forces scenario.</w:t>
             </w:r>
           </w:p>
         </w:tc>
@@ -345,106 +470,6 @@
               <w:rPr>
                 <w:b/>
               </w:rPr>
-              <w:t>df_toronto</w:t>
-            </w:r>
-          </w:p>
-        </w:tc>
-        <w:tc>
-          <w:tcPr>
-            <w:tcW w:type="dxa" w:w="6768"/>
-          </w:tcPr>
-          <w:p>
-            <w:r>
-              <w:t>Toronto Police Service collision DataFrame.</w:t>
-            </w:r>
-          </w:p>
-        </w:tc>
-      </w:tr>
-      <w:tr>
-        <w:tc>
-          <w:tcPr>
-            <w:tcW w:type="dxa" w:w="2592"/>
-          </w:tcPr>
-          <w:p>
-            <w:r>
-              <w:rPr>
-                <w:b/>
-              </w:rPr>
-              <w:t>dft</w:t>
-            </w:r>
-          </w:p>
-        </w:tc>
-        <w:tc>
-          <w:tcPr>
-            <w:tcW w:type="dxa" w:w="6768"/>
-          </w:tcPr>
-          <w:p>
-            <w:r>
-              <w:t>UK DfT 2024 collision DataFrame for E_index calibration.</w:t>
-            </w:r>
-          </w:p>
-        </w:tc>
-      </w:tr>
-      <w:tr>
-        <w:tc>
-          <w:tcPr>
-            <w:tcW w:type="dxa" w:w="2592"/>
-          </w:tcPr>
-          <w:p>
-            <w:r>
-              <w:rPr>
-                <w:b/>
-              </w:rPr>
-              <w:t>df_model</w:t>
-            </w:r>
-          </w:p>
-        </w:tc>
-        <w:tc>
-          <w:tcPr>
-            <w:tcW w:type="dxa" w:w="6768"/>
-          </w:tcPr>
-          <w:p>
-            <w:r>
-              <w:t>Preprocessed 8-feature matrix + SEVERITY for ML.</w:t>
-            </w:r>
-          </w:p>
-        </w:tc>
-      </w:tr>
-      <w:tr>
-        <w:tc>
-          <w:tcPr>
-            <w:tcW w:type="dxa" w:w="2592"/>
-          </w:tcPr>
-          <w:p>
-            <w:r>
-              <w:rPr>
-                <w:b/>
-              </w:rPr>
-              <w:t>FINAL_FEATURES</w:t>
-            </w:r>
-          </w:p>
-        </w:tc>
-        <w:tc>
-          <w:tcPr>
-            <w:tcW w:type="dxa" w:w="6768"/>
-          </w:tcPr>
-          <w:p>
-            <w:r>
-              <w:t>OCC_HOUR, MONTH_NUM, SEASON_NUM, IS_NIGHT, IS_RUSHHOUR, PEDESTRIAN_BIN, BICYCLE_BIN, AUTOMOBILE_BIN.</w:t>
-            </w:r>
-          </w:p>
-        </w:tc>
-      </w:tr>
-      <w:tr>
-        <w:tc>
-          <w:tcPr>
-            <w:tcW w:type="dxa" w:w="2592"/>
-          </w:tcPr>
-          <w:p>
-            <w:r>
-              <w:rPr>
-                <w:b/>
-              </w:rPr>
               <w:t>SMOTE</w:t>
             </w:r>
           </w:p>
@@ -470,106 +495,6 @@
               <w:rPr>
                 <w:b/>
               </w:rPr>
-              <w:t>train_test_split</w:t>
-            </w:r>
-          </w:p>
-        </w:tc>
-        <w:tc>
-          <w:tcPr>
-            <w:tcW w:type="dxa" w:w="6768"/>
-          </w:tcPr>
-          <w:p>
-            <w:r>
-              <w:t>80/20 stratified split (test_size=0.20, random_state=42).</w:t>
-            </w:r>
-          </w:p>
-        </w:tc>
-      </w:tr>
-      <w:tr>
-        <w:tc>
-          <w:tcPr>
-            <w:tcW w:type="dxa" w:w="2592"/>
-          </w:tcPr>
-          <w:p>
-            <w:r>
-              <w:rPr>
-                <w:b/>
-              </w:rPr>
-              <w:t>StratifiedKFold</w:t>
-            </w:r>
-          </w:p>
-        </w:tc>
-        <w:tc>
-          <w:tcPr>
-            <w:tcW w:type="dxa" w:w="6768"/>
-          </w:tcPr>
-          <w:p>
-            <w:r>
-              <w:t>3-fold CV preserving class ratios inside GridSearchCV.</w:t>
-            </w:r>
-          </w:p>
-        </w:tc>
-      </w:tr>
-      <w:tr>
-        <w:tc>
-          <w:tcPr>
-            <w:tcW w:type="dxa" w:w="2592"/>
-          </w:tcPr>
-          <w:p>
-            <w:r>
-              <w:rPr>
-                <w:b/>
-              </w:rPr>
-              <w:t>GridSearchCV</w:t>
-            </w:r>
-          </w:p>
-        </w:tc>
-        <w:tc>
-          <w:tcPr>
-            <w:tcW w:type="dxa" w:w="6768"/>
-          </w:tcPr>
-          <w:p>
-            <w:r>
-              <w:t>Hyperparameter search with cross-validation on training data.</w:t>
-            </w:r>
-          </w:p>
-        </w:tc>
-      </w:tr>
-      <w:tr>
-        <w:tc>
-          <w:tcPr>
-            <w:tcW w:type="dxa" w:w="2592"/>
-          </w:tcPr>
-          <w:p>
-            <w:r>
-              <w:rPr>
-                <w:b/>
-              </w:rPr>
-              <w:t>StandardScaler</w:t>
-            </w:r>
-          </w:p>
-        </w:tc>
-        <w:tc>
-          <w:tcPr>
-            <w:tcW w:type="dxa" w:w="6768"/>
-          </w:tcPr>
-          <w:p>
-            <w:r>
-              <w:t>Feature scaling fit on train, applied to test.</w:t>
-            </w:r>
-          </w:p>
-        </w:tc>
-      </w:tr>
-      <w:tr>
-        <w:tc>
-          <w:tcPr>
-            <w:tcW w:type="dxa" w:w="2592"/>
-          </w:tcPr>
-          <w:p>
-            <w:r>
-              <w:rPr>
-                <w:b/>
-              </w:rPr>
               <w:t>MCC</w:t>
             </w:r>
           </w:p>
@@ -580,7 +505,7 @@
           </w:tcPr>
           <w:p>
             <w:r>
-              <w:t>Matthews Correlation Coefficient — primary metric for imbalanced multi-class.</w:t>
+              <w:t>Matthews Correlation Coefficient — preferred under class imbalance.</w:t>
             </w:r>
           </w:p>
         </w:tc>
@@ -605,32 +530,7 @@
           </w:tcPr>
           <w:p>
             <w:r>
-              <w:t>SHapley values explaining each feature's contribution to predictions.</w:t>
-            </w:r>
-          </w:p>
-        </w:tc>
-      </w:tr>
-      <w:tr>
-        <w:tc>
-          <w:tcPr>
-            <w:tcW w:type="dxa" w:w="2592"/>
-          </w:tcPr>
-          <w:p>
-            <w:r>
-              <w:rPr>
-                <w:b/>
-              </w:rPr>
-              <w:t>ShieldDNN</w:t>
-            </w:r>
-          </w:p>
-        </w:tc>
-        <w:tc>
-          <w:tcPr>
-            <w:tcW w:type="dxa" w:w="6768"/>
-          </w:tcPr>
-          <w:p>
-            <w:r>
-              <w:t>PyTorch DNN: 256-128-64 layers with BatchNorm and Dropout.</w:t>
+              <w:t>SHapley values explaining RF feature contributions.</w:t>
             </w:r>
           </w:p>
         </w:tc>
@@ -655,7 +555,32 @@
           </w:tcPr>
           <w:p>
             <w:r>
-              <w:t>CNN fine-tuned for clear/wet/snow-ice road surfaces.</w:t>
+              <w:t>Selected vision backend for Clear / Wet / Snow-Ice; ImageNet transfer learning.</w:t>
+            </w:r>
+          </w:p>
+        </w:tc>
+      </w:tr>
+      <w:tr>
+        <w:tc>
+          <w:tcPr>
+            <w:tcW w:type="dxa" w:w="2592"/>
+          </w:tcPr>
+          <w:p>
+            <w:r>
+              <w:rPr>
+                <w:b/>
+              </w:rPr>
+              <w:t>vision_meta.json</w:t>
+            </w:r>
+          </w:p>
+        </w:tc>
+        <w:tc>
+          <w:tcPr>
+            <w:tcW w:type="dxa" w:w="6768"/>
+          </w:tcPr>
+          <w:p>
+            <w:r>
+              <w:t>Stores selected backend, hybrid flag, and Mean V by class for the demo.</w:t>
             </w:r>
           </w:p>
         </w:tc>
@@ -680,82 +605,7 @@
           </w:tcPr>
           <w:p>
             <w:r>
-              <w:t>Production tuned Random Forest loaded by the demo.</w:t>
-            </w:r>
-          </w:p>
-        </w:tc>
-      </w:tr>
-      <w:tr>
-        <w:tc>
-          <w:tcPr>
-            <w:tcW w:type="dxa" w:w="2592"/>
-          </w:tcPr>
-          <w:p>
-            <w:r>
-              <w:rPr>
-                <w:b/>
-              </w:rPr>
-              <w:t>Sprint 1-2</w:t>
-            </w:r>
-          </w:p>
-        </w:tc>
-        <w:tc>
-          <w:tcPr>
-            <w:tcW w:type="dxa" w:w="6768"/>
-          </w:tcPr>
-          <w:p>
-            <w:r>
-              <w:t>Data loading, EDA, preprocessing, feature selection.</w:t>
-            </w:r>
-          </w:p>
-        </w:tc>
-      </w:tr>
-      <w:tr>
-        <w:tc>
-          <w:tcPr>
-            <w:tcW w:type="dxa" w:w="2592"/>
-          </w:tcPr>
-          <w:p>
-            <w:r>
-              <w:rPr>
-                <w:b/>
-              </w:rPr>
-              <w:t>Sprint 2</w:t>
-            </w:r>
-          </w:p>
-        </w:tc>
-        <w:tc>
-          <w:tcPr>
-            <w:tcW w:type="dxa" w:w="6768"/>
-          </w:tcPr>
-          <w:p>
-            <w:r>
-              <w:t>Baselines, GridSearchCV, DNN, Vision Brain, ethics.</w:t>
-            </w:r>
-          </w:p>
-        </w:tc>
-      </w:tr>
-      <w:tr>
-        <w:tc>
-          <w:tcPr>
-            <w:tcW w:type="dxa" w:w="2592"/>
-          </w:tcPr>
-          <w:p>
-            <w:r>
-              <w:rPr>
-                <w:b/>
-              </w:rPr>
-              <w:t>Sprint 3</w:t>
-            </w:r>
-          </w:p>
-        </w:tc>
-        <w:tc>
-          <w:tcPr>
-            <w:tcW w:type="dxa" w:w="6768"/>
-          </w:tcPr>
-          <w:p>
-            <w:r>
-              <w:t>NLP fusion, Safety Score, SHAP, model serialization.</w:t>
+              <w:t>Tuned Random Forest artifact loaded by the demo for collision-risk context.</w:t>
             </w:r>
           </w:p>
         </w:tc>

</xml_diff>